<commit_message>
feat: Documentación con modificaciones menores y cambnios de estilo y contenido en la pressentacion
</commit_message>
<xml_diff>
--- a/documentacion/Informe_técnico.docx
+++ b/documentacion/Informe_técnico.docx
@@ -78,12 +78,12 @@
             <wp:extent cx="5734050" cy="1930202"/>
             <wp:effectExtent b="0" l="0" r="0" t="0"/>
             <wp:wrapNone/>
-            <wp:docPr id="9" name="image5.png"/>
+            <wp:docPr id="9" name="image4.png"/>
             <a:graphic>
               <a:graphicData uri="http://schemas.openxmlformats.org/drawingml/2006/picture">
                 <pic:pic>
                   <pic:nvPicPr>
-                    <pic:cNvPr id="0" name="image5.png"/>
+                    <pic:cNvPr id="0" name="image4.png"/>
                     <pic:cNvPicPr preferRelativeResize="0"/>
                   </pic:nvPicPr>
                   <pic:blipFill>
@@ -256,7 +256,7 @@
           <w:szCs w:val="28"/>
           <w:rtl w:val="0"/>
         </w:rPr>
-        <w:t xml:space="preserve">Diseño de Red para Centro de Salud Especializado “San Olegario” </w:t>
+        <w:t xml:space="preserve">Diseño de Red para Centro de Salud Especializado “San Vergeles” </w:t>
       </w:r>
     </w:p>
     <w:p>
@@ -273,7 +273,7 @@
           <w:color w:val="434343"/>
           <w:rtl w:val="0"/>
         </w:rPr>
-        <w:t xml:space="preserve">Oleg Fernández-Llebrez Rodríguez</w:t>
+        <w:t xml:space="preserve">Fernández-Llebrez Rodríguez, Oleg </w:t>
       </w:r>
     </w:p>
     <w:p>
@@ -290,7 +290,7 @@
           <w:color w:val="434343"/>
           <w:rtl w:val="0"/>
         </w:rPr>
-        <w:t xml:space="preserve">Laura Ramos Granados </w:t>
+        <w:t xml:space="preserve">Ramos Granados, Laura </w:t>
       </w:r>
     </w:p>
     <w:p>
@@ -1422,7 +1422,20 @@
           <w:rFonts w:ascii="Archivo Light" w:cs="Archivo Light" w:eastAsia="Archivo Light" w:hAnsi="Archivo Light"/>
           <w:rtl w:val="0"/>
         </w:rPr>
-        <w:t xml:space="preserve">El Centro de Salud Municipal “San Olegario” busca mejorar su conectividad interna para dar soporte a sus servicios médicos y administrativos. Actualmente, el centro cuenta con un conjunto reducido de servicios digitales: historia clínica electrónica, un servidor web de acceso público con resultados de laboratorio, cámaras IP de seguridad, y conexión básica a Internet para consultas y gestión de turnos.</w:t>
+        <w:t xml:space="preserve">El Centro de Salud Municipal “San </w:t>
+      </w:r>
+      <w:r>
+        <w:rPr>
+          <w:rtl w:val="0"/>
+        </w:rPr>
+        <w:t xml:space="preserve">Vergeles</w:t>
+      </w:r>
+      <w:r>
+        <w:rPr>
+          <w:rFonts w:ascii="Archivo Light" w:cs="Archivo Light" w:eastAsia="Archivo Light" w:hAnsi="Archivo Light"/>
+          <w:rtl w:val="0"/>
+        </w:rPr>
+        <w:t xml:space="preserve">” busca mejorar su conectividad interna para dar soporte a sus servicios médicos y administrativos. Actualmente, el centro cuenta con un conjunto reducido de servicios digitales: historia clínica electrónica, un servidor web de acceso público con resultados de laboratorio, cámaras IP de seguridad, y conexión básica a Internet para consultas y gestión de turnos.</w:t>
       </w:r>
     </w:p>
     <w:p>
@@ -2004,7 +2017,7 @@
         <w:rPr>
           <w:rtl w:val="0"/>
         </w:rPr>
-        <w:t xml:space="preserve">La red propuesta para el Centro de Salud Municipal “San Olegario” se ha concebido con el objetivo de ofrecer segmentación lógica, alta disponibilidad y control granular del tráfico. Para alcanzar estos fines, se ha adoptado una arquitectura basada en el modelo Leaf-Spine, un enfoque común en entornos críticos como centros de datos por su simplicidad estructural y sus garantías de escalabilidad.</w:t>
+        <w:t xml:space="preserve">La red propuesta para el Centro de Salud Municipal “San Vergeles” se ha concebido con el objetivo de ofrecer segmentación lógica, alta disponibilidad y control granular del tráfico. Para alcanzar estos fines, se ha adoptado una arquitectura basada en el modelo Leaf-Spine, un enfoque común en entornos críticos como centros de datos por su simplicidad estructural y sus garantías de escalabilidad.</w:t>
       </w:r>
     </w:p>
     <w:p>
@@ -2957,7 +2970,7 @@
         <w:rPr>
           <w:rtl w:val="0"/>
         </w:rPr>
-        <w:t xml:space="preserve">La seguridad en la red del Centro de Salud “San Olegario” se ha estructurado aplicando los principios de mínimo privilegio, segmentación lógica y defensa en profundidad. Cada zona funcional de la red se encuentra contenida en una VLAN con su propia subred, y el tráfico entre zonas está mediado por políticas de seguridad explícitas en los dispositivos Fortinet y Palo Alto. </w:t>
+        <w:t xml:space="preserve">La seguridad en la red del Centro de Salud “San Vergeles” se ha estructurado aplicando los principios de mínimo privilegio, segmentación lógica y defensa en profundidad. Cada zona funcional de la red se encuentra contenida en una VLAN con su propia subred, y el tráfico entre zonas está mediado por políticas de seguridad explícitas en los dispositivos Fortinet y Palo Alto. </w:t>
       </w:r>
     </w:p>
     <w:p>
@@ -4317,7 +4330,7 @@
         <w:rPr>
           <w:rtl w:val="0"/>
         </w:rPr>
-        <w:t xml:space="preserve">El direccionamiento IP utilizado en la red del Centro de Salud “San Olegario” responde a un esquema de segmentación lógica que refuerza la separación entre zonas funcionales, simplifica la administración de red y mejora el control del tráfico en los dispositivos de seguridad perimetral. Esta planificación permite aplicar políticas de filtrado específicas por VLAN, facilita el diagnóstico ante incidentes y prepara la infraestructura para posibles ampliaciones futuras.</w:t>
+        <w:t xml:space="preserve">El direccionamiento IP utilizado en la red del Centro de Salud “San Vergeles” responde a un esquema de segmentación lógica que refuerza la separación entre zonas funcionales, simplifica la administración de red y mejora el control del tráfico en los dispositivos de seguridad perimetral. Esta planificación permite aplicar políticas de filtrado específicas por VLAN, facilita el diagnóstico ante incidentes y prepara la infraestructura para posibles ampliaciones futuras.</w:t>
       </w:r>
     </w:p>
     <w:p>
@@ -6210,7 +6223,7 @@
         <w:rPr>
           <w:rtl w:val="0"/>
         </w:rPr>
-        <w:t xml:space="preserve">Tabla 3. Imágenes y roles asignadas en topología virtualizada</w:t>
+        <w:t xml:space="preserve">Tabla 3. Reglas aplicadas en Fortinet</w:t>
       </w:r>
       <w:r>
         <w:rPr>
@@ -7197,7 +7210,7 @@
         <w:rPr>
           <w:rtl w:val="0"/>
         </w:rPr>
-        <w:t xml:space="preserve">Tabla 3. Imágenes y roles asignadas en topología virtualizada</w:t>
+        <w:t xml:space="preserve">Tabla 4. Reglas aplicadas en Palo Alto</w:t>
       </w:r>
     </w:p>
     <w:tbl>
@@ -8934,12 +8947,12 @@
             <wp:extent cx="228600" cy="228600"/>
             <wp:effectExtent b="0" l="0" r="0" t="0"/>
             <wp:wrapNone/>
-            <wp:docPr id="8" name="image1.png"/>
+            <wp:docPr id="8" name="image5.png"/>
             <a:graphic>
               <a:graphicData uri="http://schemas.openxmlformats.org/drawingml/2006/picture">
                 <pic:pic>
                   <pic:nvPicPr>
-                    <pic:cNvPr id="0" name="image1.png"/>
+                    <pic:cNvPr id="0" name="image5.png"/>
                     <pic:cNvPicPr preferRelativeResize="0"/>
                   </pic:nvPicPr>
                   <pic:blipFill>
@@ -9040,12 +9053,12 @@
             <wp:extent cx="228600" cy="232057"/>
             <wp:effectExtent b="0" l="0" r="0" t="0"/>
             <wp:wrapNone/>
-            <wp:docPr id="5" name="image4.png"/>
+            <wp:docPr id="5" name="image1.png"/>
             <a:graphic>
               <a:graphicData uri="http://schemas.openxmlformats.org/drawingml/2006/picture">
                 <pic:pic>
                   <pic:nvPicPr>
-                    <pic:cNvPr id="0" name="image4.png"/>
+                    <pic:cNvPr id="0" name="image1.png"/>
                     <pic:cNvPicPr preferRelativeResize="0"/>
                   </pic:nvPicPr>
                   <pic:blipFill>

</xml_diff>